<commit_message>
update manuscript and fig 4 for submission to jae
</commit_message>
<xml_diff>
--- a/manuscript/journal_animal_ecology_submission/cover_letter_jae.docx
+++ b/manuscript/journal_animal_ecology_submission/cover_letter_jae.docx
@@ -176,19 +176,37 @@
         <w:rPr>
           <w:lang w:val="en-CA"/>
         </w:rPr>
-        <w:t xml:space="preserve">Biodiversity conservation hinges on a clear understanding of the ecological drivers of species abundance. </w:t>
-      </w:r>
-      <w:r>
-        <w:rPr>
-          <w:lang w:val="en-CA"/>
-        </w:rPr>
-        <w:t xml:space="preserve">However, </w:t>
-      </w:r>
-      <w:r>
-        <w:rPr>
-          <w:lang w:val="en-CA"/>
-        </w:rPr>
-        <w:t xml:space="preserve">imperfect ability to detect individuals may impact our ability to estimate </w:t>
+        <w:t xml:space="preserve">Biodiversity conservation hinges on a clear understanding of the ecological drivers of species abundance. However, </w:t>
+      </w:r>
+      <w:r>
+        <w:rPr>
+          <w:lang w:val="en-CA"/>
+        </w:rPr>
+        <w:t>imperfect ability to detect individuals</w:t>
+      </w:r>
+      <w:r>
+        <w:rPr>
+          <w:lang w:val="en-CA"/>
+        </w:rPr>
+        <w:t xml:space="preserve"> in the field</w:t>
+      </w:r>
+      <w:r>
+        <w:rPr>
+          <w:lang w:val="en-CA"/>
+        </w:rPr>
+        <w:t xml:space="preserve"> </w:t>
+      </w:r>
+      <w:r>
+        <w:rPr>
+          <w:lang w:val="en-CA"/>
+        </w:rPr>
+        <w:t xml:space="preserve">can </w:t>
+      </w:r>
+      <w:r>
+        <w:rPr>
+          <w:lang w:val="en-CA"/>
+        </w:rPr>
+        <w:t xml:space="preserve">impact our ability to estimate </w:t>
       </w:r>
       <w:r>
         <w:rPr>
@@ -236,31 +254,31 @@
         <w:rPr>
           <w:lang w:val="en-CA"/>
         </w:rPr>
-        <w:t>potential</w:t>
-      </w:r>
-      <w:r>
-        <w:rPr>
-          <w:lang w:val="en-CA"/>
-        </w:rPr>
-        <w:t xml:space="preserve"> detection confound</w:t>
-      </w:r>
-      <w:r>
-        <w:rPr>
-          <w:lang w:val="en-CA"/>
-        </w:rPr>
-        <w:t>s caused by habitat quality impact</w:t>
-      </w:r>
-      <w:r>
-        <w:rPr>
-          <w:lang w:val="en-CA"/>
-        </w:rPr>
-        <w:t xml:space="preserve"> our ability to </w:t>
-      </w:r>
-      <w:r>
-        <w:rPr>
-          <w:lang w:val="en-CA"/>
-        </w:rPr>
-        <w:t>measure</w:t>
+        <w:t xml:space="preserve">imperfect </w:t>
+      </w:r>
+      <w:r>
+        <w:rPr>
+          <w:lang w:val="en-CA"/>
+        </w:rPr>
+        <w:t xml:space="preserve">detection </w:t>
+      </w:r>
+      <w:r>
+        <w:rPr>
+          <w:lang w:val="en-CA"/>
+        </w:rPr>
+        <w:t>is</w:t>
+      </w:r>
+      <w:r>
+        <w:rPr>
+          <w:lang w:val="en-CA"/>
+        </w:rPr>
+        <w:t xml:space="preserve"> impact</w:t>
+      </w:r>
+      <w:r>
+        <w:rPr>
+          <w:lang w:val="en-CA"/>
+        </w:rPr>
+        <w:t>ing</w:t>
       </w:r>
       <w:r>
         <w:rPr>
@@ -272,25 +290,13 @@
         <w:rPr>
           <w:lang w:val="en-CA"/>
         </w:rPr>
-        <w:t>changes</w:t>
-      </w:r>
-      <w:r>
-        <w:rPr>
-          <w:lang w:val="en-CA"/>
-        </w:rPr>
-        <w:t xml:space="preserve"> in </w:t>
-      </w:r>
-      <w:r>
-        <w:rPr>
-          <w:lang w:val="en-CA"/>
-        </w:rPr>
-        <w:t xml:space="preserve">the </w:t>
-      </w:r>
-      <w:r>
-        <w:rPr>
-          <w:lang w:val="en-CA"/>
-        </w:rPr>
-        <w:t xml:space="preserve">abundance of insects. </w:t>
+        <w:t>these estimates and what approaches might mitigate these impacts.</w:t>
+      </w:r>
+      <w:r>
+        <w:rPr>
+          <w:lang w:val="en-CA"/>
+        </w:rPr>
+        <w:t xml:space="preserve"> </w:t>
       </w:r>
       <w:r>
         <w:rPr>
@@ -337,76 +343,82 @@
         <w:t xml:space="preserve"> determine the effect of </w:t>
       </w:r>
       <w:r>
-        <w:t>urban park</w:t>
+        <w:t xml:space="preserve">urban </w:t>
+      </w:r>
+      <w:r>
+        <w:t xml:space="preserve">habitat </w:t>
+      </w:r>
+      <w:r>
+        <w:t xml:space="preserve">restoration </w:t>
+      </w:r>
+      <w:r>
+        <w:t xml:space="preserve">on the </w:t>
+      </w:r>
+      <w:r>
+        <w:t>detectability</w:t>
+      </w:r>
+      <w:r>
+        <w:t xml:space="preserve"> and abundance of wild bees. </w:t>
+      </w:r>
+      <w:r>
+        <w:t xml:space="preserve">We hypothesized that taller vegetation and </w:t>
+      </w:r>
+      <w:r>
+        <w:t>more</w:t>
+      </w:r>
+      <w:r>
+        <w:t xml:space="preserve"> floral resources in restored parks increase</w:t>
+      </w:r>
+      <w:r>
+        <w:t>s</w:t>
       </w:r>
       <w:r>
         <w:t xml:space="preserve"> </w:t>
       </w:r>
       <w:r>
-        <w:t xml:space="preserve">habitat </w:t>
-      </w:r>
-      <w:r>
-        <w:t xml:space="preserve">restoration </w:t>
-      </w:r>
-      <w:r>
-        <w:t xml:space="preserve">on the </w:t>
-      </w:r>
-      <w:r>
-        <w:t>detectability</w:t>
-      </w:r>
-      <w:r>
-        <w:t xml:space="preserve"> and abundance of wild bees. </w:t>
-      </w:r>
-      <w:r>
-        <w:t xml:space="preserve">We hypothesized that taller vegetation and </w:t>
-      </w:r>
-      <w:r>
-        <w:t>more</w:t>
-      </w:r>
-      <w:r>
-        <w:t xml:space="preserve"> floral resources in restored parks increase</w:t>
-      </w:r>
-      <w:r>
-        <w:t>s</w:t>
+        <w:t>bee</w:t>
+      </w:r>
+      <w:r>
+        <w:t xml:space="preserve"> detection rates. </w:t>
+      </w:r>
+      <w:r>
+        <w:t>We compared our estimates to conventional GLMs, which do not account for detection, and binomial N-mixture models</w:t>
+      </w:r>
+      <w:r>
+        <w:t>, which account for detection without requiring mark-recapture data</w:t>
+      </w:r>
+      <w:r>
+        <w:t>.</w:t>
       </w:r>
       <w:r>
         <w:t xml:space="preserve"> </w:t>
       </w:r>
       <w:r>
-        <w:t>bee</w:t>
-      </w:r>
-      <w:r>
-        <w:t xml:space="preserve"> detection rates. </w:t>
-      </w:r>
-      <w:r>
-        <w:t>We compared our estimates to conventional GLMs, which do not account for detection, and binomial N-mixture models</w:t>
-      </w:r>
-      <w:r>
-        <w:t>, which account for detection without requiring mark-recapture data</w:t>
-      </w:r>
-      <w:r>
-        <w:t>.</w:t>
+        <w:t>Our mark-recapture approach</w:t>
       </w:r>
       <w:r>
         <w:t xml:space="preserve"> </w:t>
       </w:r>
       <w:r>
-        <w:t>Our mark-recapture approach</w:t>
-      </w:r>
-      <w:r>
-        <w:t xml:space="preserve"> </w:t>
-      </w:r>
-      <w:r>
-        <w:t>suggested</w:t>
-      </w:r>
-      <w:r>
-        <w:t xml:space="preserve"> that </w:t>
+        <w:t xml:space="preserve">indicated </w:t>
+      </w:r>
+      <w:r>
+        <w:t xml:space="preserve">that </w:t>
       </w:r>
       <w:r>
         <w:t xml:space="preserve">restored habitats increased individual bee detection rates </w:t>
       </w:r>
       <w:r>
-        <w:t>~1.6 fold. A conventional GLM overestimated the impacts of restoration on bee abundance. Using simulation</w:t>
+        <w:t xml:space="preserve">~1.6 fold. </w:t>
+      </w:r>
+      <w:r>
+        <w:t xml:space="preserve">On the other hand, the </w:t>
+      </w:r>
+      <w:r>
+        <w:t xml:space="preserve">conventional GLM overestimated the </w:t>
+      </w:r>
+      <w:r>
+        <w:t>impacts of restoration on bee abundance. Using simulation</w:t>
       </w:r>
       <w:r>
         <w:t>,</w:t>
@@ -415,13 +427,34 @@
         <w:t xml:space="preserve"> we </w:t>
       </w:r>
       <w:r>
-        <w:t>demonstrated that our mark-recapture approach also provides robust estimates for a hypothesized abundance driver despite movement of individuals in and out of sampling areas</w:t>
-      </w:r>
-      <w:r>
-        <w:t>, while binomial N-mixture models do not</w:t>
-      </w:r>
-      <w:r>
-        <w:t xml:space="preserve">. Finally, using simulation, we </w:t>
+        <w:t xml:space="preserve">demonstrated that our mark-recapture approach </w:t>
+      </w:r>
+      <w:r>
+        <w:t>was</w:t>
+      </w:r>
+      <w:r>
+        <w:t xml:space="preserve"> robust estimates for a hypothesized abundance driver despite movement of individuals in and out of sampling areas</w:t>
+      </w:r>
+      <w:r>
+        <w:t xml:space="preserve">, </w:t>
+      </w:r>
+      <w:r>
+        <w:t>while in contrast</w:t>
+      </w:r>
+      <w:r>
+        <w:t xml:space="preserve"> binomial N-mixture model</w:t>
+      </w:r>
+      <w:r>
+        <w:t xml:space="preserve"> approaches were</w:t>
+      </w:r>
+      <w:r>
+        <w:t xml:space="preserve"> not</w:t>
+      </w:r>
+      <w:r>
+        <w:t xml:space="preserve">. Finally, using </w:t>
+      </w:r>
+      <w:r>
+        <w:t xml:space="preserve">simulation, we </w:t>
       </w:r>
       <w:r>
         <w:t>found</w:t>
@@ -447,19 +480,61 @@
         <w:rPr>
           <w:lang w:val="en-CA"/>
         </w:rPr>
-        <w:t>Previously, researchers have debated whether habitat qualit</w:t>
-      </w:r>
-      <w:r>
-        <w:rPr>
-          <w:lang w:val="en-CA"/>
-        </w:rPr>
-        <w:t>ies</w:t>
-      </w:r>
-      <w:r>
-        <w:rPr>
-          <w:lang w:val="en-CA"/>
-        </w:rPr>
-        <w:t xml:space="preserve"> impact our ability to capture wild bees or other insects. In this study, we provide the first quantitative evidence that habitats with taller vegetation and more floral resources increase wild bee detection rates. </w:t>
+        <w:t>Previous r</w:t>
+      </w:r>
+      <w:r>
+        <w:rPr>
+          <w:lang w:val="en-CA"/>
+        </w:rPr>
+        <w:t xml:space="preserve">esearchers have </w:t>
+      </w:r>
+      <w:r>
+        <w:rPr>
+          <w:lang w:val="en-CA"/>
+        </w:rPr>
+        <w:t>question</w:t>
+      </w:r>
+      <w:r>
+        <w:rPr>
+          <w:lang w:val="en-CA"/>
+        </w:rPr>
+        <w:t>ed</w:t>
+      </w:r>
+      <w:r>
+        <w:rPr>
+          <w:lang w:val="en-CA"/>
+        </w:rPr>
+        <w:t xml:space="preserve"> </w:t>
+      </w:r>
+      <w:r>
+        <w:rPr>
+          <w:lang w:val="en-CA"/>
+        </w:rPr>
+        <w:t>whether habitat impact</w:t>
+      </w:r>
+      <w:r>
+        <w:rPr>
+          <w:lang w:val="en-CA"/>
+        </w:rPr>
+        <w:t>s</w:t>
+      </w:r>
+      <w:r>
+        <w:rPr>
+          <w:lang w:val="en-CA"/>
+        </w:rPr>
+        <w:t xml:space="preserve"> our ability to </w:t>
+      </w:r>
+      <w:r>
+        <w:rPr>
+          <w:lang w:val="en-CA"/>
+        </w:rPr>
+        <w:t xml:space="preserve">detect </w:t>
+      </w:r>
+      <w:r>
+        <w:rPr>
+          <w:lang w:val="en-CA"/>
+        </w:rPr>
+        <w:t xml:space="preserve">wild bees or other insects. In this study, we provide the first quantitative evidence that habitats with taller vegetation and more floral resources increase wild bee detection rates. </w:t>
       </w:r>
       <w:r>
         <w:rPr>
@@ -549,19 +624,55 @@
         <w:rPr>
           <w:lang w:val="en-CA"/>
         </w:rPr>
-        <w:t xml:space="preserve">that this detection confound biases </w:t>
-      </w:r>
-      <w:r>
-        <w:rPr>
-          <w:lang w:val="en-CA"/>
-        </w:rPr>
-        <w:t xml:space="preserve">conventional GLM </w:t>
-      </w:r>
-      <w:r>
-        <w:rPr>
-          <w:lang w:val="en-CA"/>
-        </w:rPr>
-        <w:t xml:space="preserve">estimates. </w:t>
+        <w:t>that this detection</w:t>
+      </w:r>
+      <w:r>
+        <w:rPr>
+          <w:lang w:val="en-CA"/>
+        </w:rPr>
+        <w:t xml:space="preserve"> can</w:t>
+      </w:r>
+      <w:r>
+        <w:rPr>
+          <w:lang w:val="en-CA"/>
+        </w:rPr>
+        <w:t xml:space="preserve"> </w:t>
+      </w:r>
+      <w:r>
+        <w:rPr>
+          <w:lang w:val="en-CA"/>
+        </w:rPr>
+        <w:t xml:space="preserve">lead to </w:t>
+      </w:r>
+      <w:r>
+        <w:rPr>
+          <w:lang w:val="en-CA"/>
+        </w:rPr>
+        <w:t>biases</w:t>
+      </w:r>
+      <w:r>
+        <w:rPr>
+          <w:lang w:val="en-CA"/>
+        </w:rPr>
+        <w:t xml:space="preserve"> in parameter estimates produced by</w:t>
+      </w:r>
+      <w:r>
+        <w:rPr>
+          <w:lang w:val="en-CA"/>
+        </w:rPr>
+        <w:t xml:space="preserve"> </w:t>
+      </w:r>
+      <w:r>
+        <w:rPr>
+          <w:lang w:val="en-CA"/>
+        </w:rPr>
+        <w:t>conventional GLM</w:t>
+      </w:r>
+      <w:r>
+        <w:rPr>
+          <w:lang w:val="en-CA"/>
+        </w:rPr>
+        <w:t xml:space="preserve">. </w:t>
       </w:r>
       <w:r>
         <w:rPr>
@@ -585,7 +696,13 @@
         <w:rPr>
           <w:lang w:val="en-CA"/>
         </w:rPr>
-        <w:t xml:space="preserve"> the standard methodology for insect population and community studies</w:t>
+        <w:t xml:space="preserve"> the standard methodology for insect population and community </w:t>
+      </w:r>
+      <w:r>
+        <w:rPr>
+          <w:lang w:val="en-CA"/>
+        </w:rPr>
+        <w:t>studies</w:t>
       </w:r>
       <w:r>
         <w:rPr>
@@ -597,7 +714,43 @@
         <w:rPr>
           <w:lang w:val="en-CA"/>
         </w:rPr>
-        <w:t>results about how sampling intensity and site number impact GLM accuracy challenges the</w:t>
+        <w:t xml:space="preserve">results </w:t>
+      </w:r>
+      <w:r>
+        <w:rPr>
+          <w:lang w:val="en-CA"/>
+        </w:rPr>
+        <w:t>show that</w:t>
+      </w:r>
+      <w:r>
+        <w:rPr>
+          <w:lang w:val="en-CA"/>
+        </w:rPr>
+        <w:t xml:space="preserve"> sampling intensity and site number impact GLM accuracy</w:t>
+      </w:r>
+      <w:r>
+        <w:rPr>
+          <w:lang w:val="en-CA"/>
+        </w:rPr>
+        <w:t>,</w:t>
+      </w:r>
+      <w:r>
+        <w:rPr>
+          <w:lang w:val="en-CA"/>
+        </w:rPr>
+        <w:t xml:space="preserve"> </w:t>
+      </w:r>
+      <w:r>
+        <w:rPr>
+          <w:lang w:val="en-CA"/>
+        </w:rPr>
+        <w:t xml:space="preserve">challenging </w:t>
+      </w:r>
+      <w:r>
+        <w:rPr>
+          <w:lang w:val="en-CA"/>
+        </w:rPr>
+        <w:t>the</w:t>
       </w:r>
       <w:r>
         <w:rPr>
@@ -648,19 +801,19 @@
         <w:rPr>
           <w:color w:val="000000"/>
         </w:rPr>
-        <w:t xml:space="preserve">We believe that our findings of </w:t>
-      </w:r>
-      <w:r>
-        <w:rPr>
-          <w:color w:val="000000"/>
-        </w:rPr>
-        <w:t>how to better design and carry out studies of insect abundance</w:t>
-      </w:r>
-      <w:r>
-        <w:rPr>
-          <w:color w:val="000000"/>
-        </w:rPr>
-        <w:t xml:space="preserve"> will be of great interest to readers of </w:t>
+        <w:t>Because of their relevance to design and inference, w</w:t>
+      </w:r>
+      <w:r>
+        <w:rPr>
+          <w:color w:val="000000"/>
+        </w:rPr>
+        <w:t xml:space="preserve">e </w:t>
+      </w:r>
+      <w:r>
+        <w:rPr>
+          <w:color w:val="000000"/>
+        </w:rPr>
+        <w:t xml:space="preserve">believe that our findings will be of great interest to readers of </w:t>
       </w:r>
       <w:r>
         <w:rPr>
@@ -684,7 +837,6 @@
           <w:color w:val="000000"/>
         </w:rPr>
       </w:pPr>
-      <w:commentRangeStart w:id="0"/>
       <w:r>
         <w:rPr>
           <w:color w:val="000000"/>
@@ -695,33 +847,13 @@
         <w:rPr>
           <w:color w:val="000000"/>
         </w:rPr>
-        <w:t xml:space="preserve">have </w:t>
-      </w:r>
-      <w:r>
-        <w:rPr>
-          <w:color w:val="000000"/>
-        </w:rPr>
         <w:t>suggest</w:t>
       </w:r>
       <w:r>
         <w:rPr>
           <w:color w:val="000000"/>
         </w:rPr>
-        <w:t>ed</w:t>
-      </w:r>
-      <w:r>
-        <w:rPr>
-          <w:color w:val="000000"/>
-        </w:rPr>
         <w:t xml:space="preserve"> reviewers with expertise in hierarchical models and/or mark-recapture in addition to reviewers with expertise in insect ecology. </w:t>
-      </w:r>
-      <w:commentRangeEnd w:id="0"/>
-      <w:r>
-        <w:rPr>
-          <w:rStyle w:val="CommentReference"/>
-          <w:rFonts w:ascii="Calibri" w:eastAsia="Calibri" w:hAnsi="Calibri"/>
-        </w:rPr>
-        <w:commentReference w:id="0"/>
       </w:r>
       <w:r>
         <w:rPr>
@@ -789,12 +921,12 @@
       </w:r>
     </w:p>
     <w:sectPr>
-      <w:headerReference w:type="even" r:id="rId10"/>
-      <w:headerReference w:type="default" r:id="rId11"/>
-      <w:footerReference w:type="even" r:id="rId12"/>
-      <w:footerReference w:type="default" r:id="rId13"/>
-      <w:headerReference w:type="first" r:id="rId14"/>
-      <w:footerReference w:type="first" r:id="rId15"/>
+      <w:headerReference w:type="even" r:id="rId6"/>
+      <w:headerReference w:type="default" r:id="rId7"/>
+      <w:footerReference w:type="even" r:id="rId8"/>
+      <w:footerReference w:type="default" r:id="rId9"/>
+      <w:headerReference w:type="first" r:id="rId10"/>
+      <w:footerReference w:type="first" r:id="rId11"/>
       <w:pgSz w:w="12240" w:h="15840"/>
       <w:pgMar w:top="1440" w:right="1080" w:bottom="1440" w:left="1080" w:header="720" w:footer="720" w:gutter="0"/>
       <w:cols w:space="720"/>
@@ -803,48 +935,6 @@
     </w:sectPr>
   </w:body>
 </w:document>
-</file>
-
-<file path=word/comments.xml><?xml version="1.0" encoding="utf-8"?>
-<w:comments xmlns:wpc="http://schemas.microsoft.com/office/word/2010/wordprocessingCanvas" xmlns:cx="http://schemas.microsoft.com/office/drawing/2014/chartex" xmlns:cx1="http://schemas.microsoft.com/office/drawing/2015/9/8/chartex" xmlns:cx2="http://schemas.microsoft.com/office/drawing/2015/10/21/chartex" xmlns:cx3="http://schemas.microsoft.com/office/drawing/2016/5/9/chartex" xmlns:cx4="http://schemas.microsoft.com/office/drawing/2016/5/10/chartex" xmlns:cx5="http://schemas.microsoft.com/office/drawing/2016/5/11/chartex" xmlns:cx6="http://schemas.microsoft.com/office/drawing/2016/5/12/chartex" xmlns:cx7="http://schemas.microsoft.com/office/drawing/2016/5/13/chartex" xmlns:cx8="http://schemas.microsoft.com/office/drawing/2016/5/14/chartex" xmlns:mc="http://schemas.openxmlformats.org/markup-compatibility/2006" xmlns:aink="http://schemas.microsoft.com/office/drawing/2016/ink" xmlns:am3d="http://schemas.microsoft.com/office/drawing/2017/model3d" xmlns:o="urn:schemas-microsoft-com:office:office" xmlns:oel="http://schemas.microsoft.com/office/2019/extlst" xmlns:r="http://schemas.openxmlformats.org/officeDocument/2006/relationships" xmlns:m="http://schemas.openxmlformats.org/officeDocument/2006/math" xmlns:v="urn:schemas-microsoft-com:vml" xmlns:wp14="http://schemas.microsoft.com/office/word/2010/wordprocessingDrawing" xmlns:wp="http://schemas.openxmlformats.org/drawingml/2006/wordprocessingDrawing" xmlns:w10="urn:schemas-microsoft-com:office:word" xmlns:w="http://schemas.openxmlformats.org/wordprocessingml/2006/main" xmlns:w14="http://schemas.microsoft.com/office/word/2010/wordml" xmlns:w15="http://schemas.microsoft.com/office/word/2012/wordml" xmlns:w16cex="http://schemas.microsoft.com/office/word/2018/wordml/cex" xmlns:w16cid="http://schemas.microsoft.com/office/word/2016/wordml/cid" xmlns:w16="http://schemas.microsoft.com/office/word/2018/wordml" xmlns:w16du="http://schemas.microsoft.com/office/word/2023/wordml/word16du" xmlns:w16sdtdh="http://schemas.microsoft.com/office/word/2020/wordml/sdtdatahash" xmlns:w16se="http://schemas.microsoft.com/office/word/2015/wordml/symex" xmlns:wpg="http://schemas.microsoft.com/office/word/2010/wordprocessingGroup" xmlns:wpi="http://schemas.microsoft.com/office/word/2010/wordprocessingInk" xmlns:wne="http://schemas.microsoft.com/office/word/2006/wordml" xmlns:wps="http://schemas.microsoft.com/office/word/2010/wordprocessingShape" mc:Ignorable="w14 w15 w16se w16cid w16 w16cex w16sdtdh w16du wp14">
-  <w:comment w:id="0" w:author="Jens Ulrich" w:date="2025-04-25T15:12:00Z" w:initials="JU">
-    <w:p>
-      <w:pPr>
-        <w:pStyle w:val="CommentText"/>
-      </w:pPr>
-      <w:r>
-        <w:rPr>
-          <w:rStyle w:val="CommentReference"/>
-        </w:rPr>
-        <w:annotationRef/>
-      </w:r>
-      <w:r>
-        <w:rPr>
-          <w:lang w:val="en-CA"/>
-        </w:rPr>
-        <w:t>Just wanted to include this here so we don’t have another instance where the manuscript goes back to review because none of the reviewers that they selected were comfortable with providing feedback on the statistical methods!</w:t>
-      </w:r>
-    </w:p>
-  </w:comment>
-</w:comments>
-</file>
-
-<file path=word/commentsExtended.xml><?xml version="1.0" encoding="utf-8"?>
-<w15:commentsEx xmlns:wpc="http://schemas.microsoft.com/office/word/2010/wordprocessingCanvas" xmlns:cx="http://schemas.microsoft.com/office/drawing/2014/chartex" xmlns:cx1="http://schemas.microsoft.com/office/drawing/2015/9/8/chartex" xmlns:cx2="http://schemas.microsoft.com/office/drawing/2015/10/21/chartex" xmlns:cx3="http://schemas.microsoft.com/office/drawing/2016/5/9/chartex" xmlns:cx4="http://schemas.microsoft.com/office/drawing/2016/5/10/chartex" xmlns:cx5="http://schemas.microsoft.com/office/drawing/2016/5/11/chartex" xmlns:cx6="http://schemas.microsoft.com/office/drawing/2016/5/12/chartex" xmlns:cx7="http://schemas.microsoft.com/office/drawing/2016/5/13/chartex" xmlns:cx8="http://schemas.microsoft.com/office/drawing/2016/5/14/chartex" xmlns:mc="http://schemas.openxmlformats.org/markup-compatibility/2006" xmlns:aink="http://schemas.microsoft.com/office/drawing/2016/ink" xmlns:am3d="http://schemas.microsoft.com/office/drawing/2017/model3d" xmlns:o="urn:schemas-microsoft-com:office:office" xmlns:oel="http://schemas.microsoft.com/office/2019/extlst" xmlns:r="http://schemas.openxmlformats.org/officeDocument/2006/relationships" xmlns:m="http://schemas.openxmlformats.org/officeDocument/2006/math" xmlns:v="urn:schemas-microsoft-com:vml" xmlns:wp14="http://schemas.microsoft.com/office/word/2010/wordprocessingDrawing" xmlns:wp="http://schemas.openxmlformats.org/drawingml/2006/wordprocessingDrawing" xmlns:w10="urn:schemas-microsoft-com:office:word" xmlns:w="http://schemas.openxmlformats.org/wordprocessingml/2006/main" xmlns:w14="http://schemas.microsoft.com/office/word/2010/wordml" xmlns:w15="http://schemas.microsoft.com/office/word/2012/wordml" xmlns:w16cex="http://schemas.microsoft.com/office/word/2018/wordml/cex" xmlns:w16cid="http://schemas.microsoft.com/office/word/2016/wordml/cid" xmlns:w16="http://schemas.microsoft.com/office/word/2018/wordml" xmlns:w16du="http://schemas.microsoft.com/office/word/2023/wordml/word16du" xmlns:w16sdtdh="http://schemas.microsoft.com/office/word/2020/wordml/sdtdatahash" xmlns:w16se="http://schemas.microsoft.com/office/word/2015/wordml/symex" xmlns:wpg="http://schemas.microsoft.com/office/word/2010/wordprocessingGroup" xmlns:wpi="http://schemas.microsoft.com/office/word/2010/wordprocessingInk" xmlns:wne="http://schemas.microsoft.com/office/word/2006/wordml" xmlns:wps="http://schemas.microsoft.com/office/word/2010/wordprocessingShape" mc:Ignorable="w14 w15 w16se w16cid w16 w16cex w16sdtdh w16du wp14">
-  <w15:commentEx w15:paraId="380794C5" w15:done="0"/>
-</w15:commentsEx>
-</file>
-
-<file path=word/commentsExtensible.xml><?xml version="1.0" encoding="utf-8"?>
-<w16cex:commentsExtensible xmlns:wpc="http://schemas.microsoft.com/office/word/2010/wordprocessingCanvas" xmlns:cx="http://schemas.microsoft.com/office/drawing/2014/chartex" xmlns:cx1="http://schemas.microsoft.com/office/drawing/2015/9/8/chartex" xmlns:cx2="http://schemas.microsoft.com/office/drawing/2015/10/21/chartex" xmlns:cx3="http://schemas.microsoft.com/office/drawing/2016/5/9/chartex" xmlns:cx4="http://schemas.microsoft.com/office/drawing/2016/5/10/chartex" xmlns:cx5="http://schemas.microsoft.com/office/drawing/2016/5/11/chartex" xmlns:cx6="http://schemas.microsoft.com/office/drawing/2016/5/12/chartex" xmlns:cx7="http://schemas.microsoft.com/office/drawing/2016/5/13/chartex" xmlns:cx8="http://schemas.microsoft.com/office/drawing/2016/5/14/chartex" xmlns:cr="http://schemas.microsoft.com/office/comments/2020/reactions" xmlns:mc="http://schemas.openxmlformats.org/markup-compatibility/2006" xmlns:aink="http://schemas.microsoft.com/office/drawing/2016/ink" xmlns:am3d="http://schemas.microsoft.com/office/drawing/2017/model3d" xmlns:o="urn:schemas-microsoft-com:office:office" xmlns:oel="http://schemas.microsoft.com/office/2019/extlst" xmlns:r="http://schemas.openxmlformats.org/officeDocument/2006/relationships" xmlns:m="http://schemas.openxmlformats.org/officeDocument/2006/math" xmlns:v="urn:schemas-microsoft-com:vml" xmlns:wp14="http://schemas.microsoft.com/office/word/2010/wordprocessingDrawing" xmlns:wp="http://schemas.openxmlformats.org/drawingml/2006/wordprocessingDrawing" xmlns:w10="urn:schemas-microsoft-com:office:word" xmlns:w="http://schemas.openxmlformats.org/wordprocessingml/2006/main" xmlns:w14="http://schemas.microsoft.com/office/word/2010/wordml" xmlns:w15="http://schemas.microsoft.com/office/word/2012/wordml" xmlns:w16cex="http://schemas.microsoft.com/office/word/2018/wordml/cex" xmlns:w16cid="http://schemas.microsoft.com/office/word/2016/wordml/cid" xmlns:w16="http://schemas.microsoft.com/office/word/2018/wordml" xmlns:w16du="http://schemas.microsoft.com/office/word/2023/wordml/word16du" xmlns:w16sdtdh="http://schemas.microsoft.com/office/word/2020/wordml/sdtdatahash" xmlns:w16se="http://schemas.microsoft.com/office/word/2015/wordml/symex" xmlns:wpg="http://schemas.microsoft.com/office/word/2010/wordprocessingGroup" xmlns:wpi="http://schemas.microsoft.com/office/word/2010/wordprocessingInk" xmlns:wne="http://schemas.microsoft.com/office/word/2006/wordml" xmlns:wps="http://schemas.microsoft.com/office/word/2010/wordprocessingShape" mc:Ignorable="w14 w15 w16se w16cid w16 w16cex w16sdtdh cr w16du wp14">
-  <w16cex:commentExtensible w16cex:durableId="5768BB93" w16cex:dateUtc="2025-04-25T22:12:00Z"/>
-</w16cex:commentsExtensible>
-</file>
-
-<file path=word/commentsIds.xml><?xml version="1.0" encoding="utf-8"?>
-<w16cid:commentsIds xmlns:wpc="http://schemas.microsoft.com/office/word/2010/wordprocessingCanvas" xmlns:cx="http://schemas.microsoft.com/office/drawing/2014/chartex" xmlns:cx1="http://schemas.microsoft.com/office/drawing/2015/9/8/chartex" xmlns:cx2="http://schemas.microsoft.com/office/drawing/2015/10/21/chartex" xmlns:cx3="http://schemas.microsoft.com/office/drawing/2016/5/9/chartex" xmlns:cx4="http://schemas.microsoft.com/office/drawing/2016/5/10/chartex" xmlns:cx5="http://schemas.microsoft.com/office/drawing/2016/5/11/chartex" xmlns:cx6="http://schemas.microsoft.com/office/drawing/2016/5/12/chartex" xmlns:cx7="http://schemas.microsoft.com/office/drawing/2016/5/13/chartex" xmlns:cx8="http://schemas.microsoft.com/office/drawing/2016/5/14/chartex" xmlns:mc="http://schemas.openxmlformats.org/markup-compatibility/2006" xmlns:aink="http://schemas.microsoft.com/office/drawing/2016/ink" xmlns:am3d="http://schemas.microsoft.com/office/drawing/2017/model3d" xmlns:o="urn:schemas-microsoft-com:office:office" xmlns:oel="http://schemas.microsoft.com/office/2019/extlst" xmlns:r="http://schemas.openxmlformats.org/officeDocument/2006/relationships" xmlns:m="http://schemas.openxmlformats.org/officeDocument/2006/math" xmlns:v="urn:schemas-microsoft-com:vml" xmlns:wp14="http://schemas.microsoft.com/office/word/2010/wordprocessingDrawing" xmlns:wp="http://schemas.openxmlformats.org/drawingml/2006/wordprocessingDrawing" xmlns:w10="urn:schemas-microsoft-com:office:word" xmlns:w="http://schemas.openxmlformats.org/wordprocessingml/2006/main" xmlns:w14="http://schemas.microsoft.com/office/word/2010/wordml" xmlns:w15="http://schemas.microsoft.com/office/word/2012/wordml" xmlns:w16cex="http://schemas.microsoft.com/office/word/2018/wordml/cex" xmlns:w16cid="http://schemas.microsoft.com/office/word/2016/wordml/cid" xmlns:w16="http://schemas.microsoft.com/office/word/2018/wordml" xmlns:w16du="http://schemas.microsoft.com/office/word/2023/wordml/word16du" xmlns:w16sdtdh="http://schemas.microsoft.com/office/word/2020/wordml/sdtdatahash" xmlns:w16se="http://schemas.microsoft.com/office/word/2015/wordml/symex" xmlns:wpg="http://schemas.microsoft.com/office/word/2010/wordprocessingGroup" xmlns:wpi="http://schemas.microsoft.com/office/word/2010/wordprocessingInk" xmlns:wne="http://schemas.microsoft.com/office/word/2006/wordml" xmlns:wps="http://schemas.microsoft.com/office/word/2010/wordprocessingShape" mc:Ignorable="w14 w15 w16se w16cid w16 w16cex w16sdtdh w16du wp14">
-  <w16cid:commentId w16cid:paraId="380794C5" w16cid:durableId="5768BB93"/>
-</w16cid:commentsIds>
 </file>
 
 <file path=word/endnotes.xml><?xml version="1.0" encoding="utf-8"?>
@@ -1051,14 +1141,6 @@
     </w:r>
   </w:p>
 </w:hdr>
-</file>
-
-<file path=word/people.xml><?xml version="1.0" encoding="utf-8"?>
-<w15:people xmlns:wpc="http://schemas.microsoft.com/office/word/2010/wordprocessingCanvas" xmlns:cx="http://schemas.microsoft.com/office/drawing/2014/chartex" xmlns:cx1="http://schemas.microsoft.com/office/drawing/2015/9/8/chartex" xmlns:cx2="http://schemas.microsoft.com/office/drawing/2015/10/21/chartex" xmlns:cx3="http://schemas.microsoft.com/office/drawing/2016/5/9/chartex" xmlns:cx4="http://schemas.microsoft.com/office/drawing/2016/5/10/chartex" xmlns:cx5="http://schemas.microsoft.com/office/drawing/2016/5/11/chartex" xmlns:cx6="http://schemas.microsoft.com/office/drawing/2016/5/12/chartex" xmlns:cx7="http://schemas.microsoft.com/office/drawing/2016/5/13/chartex" xmlns:cx8="http://schemas.microsoft.com/office/drawing/2016/5/14/chartex" xmlns:mc="http://schemas.openxmlformats.org/markup-compatibility/2006" xmlns:aink="http://schemas.microsoft.com/office/drawing/2016/ink" xmlns:am3d="http://schemas.microsoft.com/office/drawing/2017/model3d" xmlns:o="urn:schemas-microsoft-com:office:office" xmlns:oel="http://schemas.microsoft.com/office/2019/extlst" xmlns:r="http://schemas.openxmlformats.org/officeDocument/2006/relationships" xmlns:m="http://schemas.openxmlformats.org/officeDocument/2006/math" xmlns:v="urn:schemas-microsoft-com:vml" xmlns:wp14="http://schemas.microsoft.com/office/word/2010/wordprocessingDrawing" xmlns:wp="http://schemas.openxmlformats.org/drawingml/2006/wordprocessingDrawing" xmlns:w10="urn:schemas-microsoft-com:office:word" xmlns:w="http://schemas.openxmlformats.org/wordprocessingml/2006/main" xmlns:w14="http://schemas.microsoft.com/office/word/2010/wordml" xmlns:w15="http://schemas.microsoft.com/office/word/2012/wordml" xmlns:w16cex="http://schemas.microsoft.com/office/word/2018/wordml/cex" xmlns:w16cid="http://schemas.microsoft.com/office/word/2016/wordml/cid" xmlns:w16="http://schemas.microsoft.com/office/word/2018/wordml" xmlns:w16du="http://schemas.microsoft.com/office/word/2023/wordml/word16du" xmlns:w16sdtdh="http://schemas.microsoft.com/office/word/2020/wordml/sdtdatahash" xmlns:w16se="http://schemas.microsoft.com/office/word/2015/wordml/symex" xmlns:wpg="http://schemas.microsoft.com/office/word/2010/wordprocessingGroup" xmlns:wpi="http://schemas.microsoft.com/office/word/2010/wordprocessingInk" xmlns:wne="http://schemas.microsoft.com/office/word/2006/wordml" xmlns:wps="http://schemas.microsoft.com/office/word/2010/wordprocessingShape" mc:Ignorable="w14 w15 w16se w16cid w16 w16cex w16sdtdh w16du wp14">
-  <w15:person w15:author="Jens Ulrich">
-    <w15:presenceInfo w15:providerId="AD" w15:userId="S::jens.johnson@ubc.ca::1d972ffb-7a27-4f01-82ee-6bfead15c41b"/>
-  </w15:person>
-</w15:people>
 </file>
 
 <file path=word/styles.xml><?xml version="1.0" encoding="utf-8"?>

</xml_diff>